<commit_message>
start to write diploma
</commit_message>
<xml_diff>
--- a/data/insights/6. Practical Significance.docx
+++ b/data/insights/6. Practical Significance.docx
@@ -3,11 +3,6 @@
 <w:document xmlns:wpc="http://schemas.microsoft.com/office/word/2010/wordprocessingCanvas" xmlns:cx="http://schemas.microsoft.com/office/drawing/2014/chartex" xmlns:cx1="http://schemas.microsoft.com/office/drawing/2015/9/8/chartex" xmlns:cx2="http://schemas.microsoft.com/office/drawing/2015/10/21/chartex" xmlns:cx3="http://schemas.microsoft.com/office/drawing/2016/5/9/chartex" xmlns:cx4="http://schemas.microsoft.com/office/drawing/2016/5/10/chartex" xmlns:cx5="http://schemas.microsoft.com/office/drawing/2016/5/11/chartex" xmlns:cx6="http://schemas.microsoft.com/office/drawing/2016/5/12/chartex" xmlns:cx7="http://schemas.microsoft.com/office/drawing/2016/5/13/chartex" xmlns:cx8="http://schemas.microsoft.com/office/drawing/2016/5/14/chartex" xmlns:mc="http://schemas.openxmlformats.org/markup-compatibility/2006" xmlns:aink="http://schemas.microsoft.com/office/drawing/2016/ink" xmlns:am3d="http://schemas.microsoft.com/office/drawing/2017/model3d" xmlns:o="urn:schemas-microsoft-com:office:office" xmlns:oel="http://schemas.microsoft.com/office/2019/extlst" xmlns:r="http://schemas.openxmlformats.org/officeDocument/2006/relationships" xmlns:m="http://schemas.openxmlformats.org/officeDocument/2006/math" xmlns:v="urn:schemas-microsoft-com:vml" xmlns:wp14="http://schemas.microsoft.com/office/word/2010/wordprocessingDrawing" xmlns:wp="http://schemas.openxmlformats.org/drawingml/2006/wordprocessingDrawing" xmlns:w10="urn:schemas-microsoft-com:office:word" xmlns:w="http://schemas.openxmlformats.org/wordprocessingml/2006/main" xmlns:w14="http://schemas.microsoft.com/office/word/2010/wordml" xmlns:w15="http://schemas.microsoft.com/office/word/2012/wordml" xmlns:w16cex="http://schemas.microsoft.com/office/word/2018/wordml/cex" xmlns:w16cid="http://schemas.microsoft.com/office/word/2016/wordml/cid" xmlns:w16="http://schemas.microsoft.com/office/word/2018/wordml" xmlns:w16sdtdh="http://schemas.microsoft.com/office/word/2020/wordml/sdtdatahash" xmlns:w16se="http://schemas.microsoft.com/office/word/2015/wordml/symex" xmlns:wpg="http://schemas.microsoft.com/office/word/2010/wordprocessingGroup" xmlns:wpi="http://schemas.microsoft.com/office/word/2010/wordprocessingInk" xmlns:wne="http://schemas.microsoft.com/office/word/2006/wordml" xmlns:wps="http://schemas.microsoft.com/office/word/2010/wordprocessingShape" mc:Ignorable="w14 w15 w16se w16cid w16 w16cex w16sdtdh wp14">
   <w:body>
     <w:p>
-      <w:pPr>
-        <w:rPr>
-          <w:lang w:val="en-US"/>
-        </w:rPr>
-      </w:pPr>
       <w:r>
         <w:t xml:space="preserve">Проведённый комплекс тестов позволяет рассматривать построенный портфель не просто как набор статистически значимых моментов, а как эмпирически выделенное </w:t>
       </w:r>
@@ -32,9 +27,6 @@
         <w:t xml:space="preserve"> в структурном смысле: не о любых переменных, коррелирующих с расходами, а о тех сигналах, которые добавляют новую идентификационную информацию к модели Эйлера. В официальных материалах Банка России подчёркивается, что ключевая ставка и коммуникация являются основными инструментами денежно-кредитной политики, а инфляционные ожидания — существенная часть механизма передачи политики, поскольку именно на их основе экономические агенты принимают решения о расходах, сбережениях и инвестициях. </w:t>
       </w:r>
       <w:r>
-        <w:rPr>
-          <w:lang w:val="en-US"/>
-        </w:rPr>
         <w:t>(</w:t>
       </w:r>
       <w:hyperlink r:id="rId4" w:history="1">
@@ -43,13 +35,107 @@
             <w:rStyle w:val="ac"/>
             <w:lang w:val="en-US"/>
           </w:rPr>
-          <w:t>https://www.cbr.ru/eng/dkp/w_infl/</w:t>
+          <w:t>https</w:t>
+        </w:r>
+        <w:r>
+          <w:rPr>
+            <w:rStyle w:val="ac"/>
+          </w:rPr>
+          <w:t>://</w:t>
+        </w:r>
+        <w:r>
+          <w:rPr>
+            <w:rStyle w:val="ac"/>
+            <w:lang w:val="en-US"/>
+          </w:rPr>
+          <w:t>www</w:t>
+        </w:r>
+        <w:r>
+          <w:rPr>
+            <w:rStyle w:val="ac"/>
+          </w:rPr>
+          <w:t>.</w:t>
+        </w:r>
+        <w:r>
+          <w:rPr>
+            <w:rStyle w:val="ac"/>
+            <w:lang w:val="en-US"/>
+          </w:rPr>
+          <w:t>cbr</w:t>
+        </w:r>
+        <w:r>
+          <w:rPr>
+            <w:rStyle w:val="ac"/>
+          </w:rPr>
+          <w:t>.</w:t>
+        </w:r>
+        <w:r>
+          <w:rPr>
+            <w:rStyle w:val="ac"/>
+            <w:lang w:val="en-US"/>
+          </w:rPr>
+          <w:t>ru</w:t>
+        </w:r>
+        <w:r>
+          <w:rPr>
+            <w:rStyle w:val="ac"/>
+          </w:rPr>
+          <w:t>/</w:t>
+        </w:r>
+        <w:r>
+          <w:rPr>
+            <w:rStyle w:val="ac"/>
+            <w:lang w:val="en-US"/>
+          </w:rPr>
+          <w:t>eng</w:t>
+        </w:r>
+        <w:r>
+          <w:rPr>
+            <w:rStyle w:val="ac"/>
+          </w:rPr>
+          <w:t>/</w:t>
+        </w:r>
+        <w:r>
+          <w:rPr>
+            <w:rStyle w:val="ac"/>
+            <w:lang w:val="en-US"/>
+          </w:rPr>
+          <w:t>dkp</w:t>
+        </w:r>
+        <w:r>
+          <w:rPr>
+            <w:rStyle w:val="ac"/>
+          </w:rPr>
+          <w:t>/</w:t>
+        </w:r>
+        <w:r>
+          <w:rPr>
+            <w:rStyle w:val="ac"/>
+            <w:lang w:val="en-US"/>
+          </w:rPr>
+          <w:t>w</w:t>
+        </w:r>
+        <w:r>
+          <w:rPr>
+            <w:rStyle w:val="ac"/>
+          </w:rPr>
+          <w:t>_</w:t>
+        </w:r>
+        <w:r>
+          <w:rPr>
+            <w:rStyle w:val="ac"/>
+            <w:lang w:val="en-US"/>
+          </w:rPr>
+          <w:t>infl</w:t>
+        </w:r>
+        <w:r>
+          <w:rPr>
+            <w:rStyle w:val="ac"/>
+          </w:rPr>
+          <w:t>/</w:t>
         </w:r>
       </w:hyperlink>
       <w:r>
-        <w:rPr>
-          <w:lang w:val="en-US"/>
-        </w:rPr>
         <w:t>)</w:t>
       </w:r>
     </w:p>
@@ -65,10 +151,7 @@
         <w:t>ключевая ставка Банка России является центральным узлом, в который вбирается информация из остальных каналов</w:t>
       </w:r>
       <w:r>
-        <w:t xml:space="preserve">. В строгом смысле это не означает доказательство “абсолютной эффективности” монетарной политики, но означает, что в данной спецификации ставка остаётся единственным независимым условно релевантным каналом, тогда как другие факторы уже не добавляют отдельной локальной информации. Это согласуется с описанием Банком России трансмиссионного механизма, где ключевая ставка влияет на ставки и доходности в основных сегментах финансового рынка, а те, в свою очередь, воздействуют на решения экономических агентов, спрос и инфляцию. </w:t>
-      </w:r>
-      <w:r>
-        <w:t>(</w:t>
+        <w:t>. В строгом смысле это не означает доказательство “абсолютной эффективности” монетарной политики, но означает, что в данной спецификации ставка остаётся единственным независимым условно релевантным каналом, тогда как другие факторы уже не добавляют отдельной локальной информации. Это согласуется с описанием Банком России трансмиссионного механизма, где ключевая ставка влияет на ставки и доходности в основных сегментах финансового рынка, а те, в свою очередь, воздействуют на решения экономических агентов, спрос и инфляцию. (</w:t>
       </w:r>
       <w:hyperlink r:id="rId5" w:history="1">
         <w:r>
@@ -97,7 +180,6 @@
           </w:rPr>
           <w:t>.</w:t>
         </w:r>
-        <w:proofErr w:type="spellStart"/>
         <w:r>
           <w:rPr>
             <w:rStyle w:val="ac"/>
@@ -105,14 +187,12 @@
           </w:rPr>
           <w:t>cbr</w:t>
         </w:r>
-        <w:proofErr w:type="spellEnd"/>
         <w:r>
           <w:rPr>
             <w:rStyle w:val="ac"/>
           </w:rPr>
           <w:t>.</w:t>
         </w:r>
-        <w:proofErr w:type="spellStart"/>
         <w:r>
           <w:rPr>
             <w:rStyle w:val="ac"/>
@@ -120,14 +200,12 @@
           </w:rPr>
           <w:t>ru</w:t>
         </w:r>
-        <w:proofErr w:type="spellEnd"/>
         <w:r>
           <w:rPr>
             <w:rStyle w:val="ac"/>
           </w:rPr>
           <w:t>/</w:t>
         </w:r>
-        <w:proofErr w:type="spellStart"/>
         <w:r>
           <w:rPr>
             <w:rStyle w:val="ac"/>
@@ -135,7 +213,6 @@
           </w:rPr>
           <w:t>eng</w:t>
         </w:r>
-        <w:proofErr w:type="spellEnd"/>
         <w:r>
           <w:rPr>
             <w:rStyle w:val="ac"/>
@@ -155,7 +232,6 @@
           </w:rPr>
           <w:t>_</w:t>
         </w:r>
-        <w:proofErr w:type="spellStart"/>
         <w:r>
           <w:rPr>
             <w:rStyle w:val="ac"/>
@@ -163,14 +239,12 @@
           </w:rPr>
           <w:t>br</w:t>
         </w:r>
-        <w:proofErr w:type="spellEnd"/>
         <w:r>
           <w:rPr>
             <w:rStyle w:val="ac"/>
           </w:rPr>
           <w:t>/</w:t>
         </w:r>
-        <w:proofErr w:type="spellStart"/>
         <w:r>
           <w:rPr>
             <w:rStyle w:val="ac"/>
@@ -178,14 +252,12 @@
           </w:rPr>
           <w:t>publ</w:t>
         </w:r>
-        <w:proofErr w:type="spellEnd"/>
         <w:r>
           <w:rPr>
             <w:rStyle w:val="ac"/>
           </w:rPr>
           <w:t>/</w:t>
         </w:r>
-        <w:proofErr w:type="spellStart"/>
         <w:r>
           <w:rPr>
             <w:rStyle w:val="ac"/>
@@ -193,7 +265,6 @@
           </w:rPr>
           <w:t>ondkp</w:t>
         </w:r>
-        <w:proofErr w:type="spellEnd"/>
         <w:r>
           <w:rPr>
             <w:rStyle w:val="ac"/>
@@ -230,10 +301,7 @@
         <w:t>диагностический индикатор качества трансмиссии</w:t>
       </w:r>
       <w:r>
-        <w:t xml:space="preserve">. Если в общем поле только ключевая ставка остаётся условно релевантной, это означает, что передача политики в данных действительно концентрируется вокруг ставочного канала. Если в последующих оценках появятся дополнительные условно релевантные независимые каналы, это будет означать, что передача политики становится менее концентрированной и что одна лишь ставка уже не “собирает” всю информацию о поведении домохозяйств. Такой вывод полезен именно как мониторинг структуры трансмиссии, а не как прогноз уровня потребления. </w:t>
-      </w:r>
-      <w:r>
-        <w:t>(</w:t>
+        <w:t>. Если в общем поле только ключевая ставка остаётся условно релевантной, это означает, что передача политики в данных действительно концентрируется вокруг ставочного канала. Если в последующих оценках появятся дополнительные условно релевантные независимые каналы, это будет означать, что передача политики становится менее концентрированной и что одна лишь ставка уже не “собирает” всю информацию о поведении домохозяйств. Такой вывод полезен именно как мониторинг структуры трансмиссии, а не как прогноз уровня потребления. (</w:t>
       </w:r>
       <w:hyperlink r:id="rId6" w:history="1">
         <w:r>
@@ -262,7 +330,6 @@
           </w:rPr>
           <w:t>.</w:t>
         </w:r>
-        <w:proofErr w:type="spellStart"/>
         <w:r>
           <w:rPr>
             <w:rStyle w:val="ac"/>
@@ -270,14 +337,12 @@
           </w:rPr>
           <w:t>cbr</w:t>
         </w:r>
-        <w:proofErr w:type="spellEnd"/>
         <w:r>
           <w:rPr>
             <w:rStyle w:val="ac"/>
           </w:rPr>
           <w:t>.</w:t>
         </w:r>
-        <w:proofErr w:type="spellStart"/>
         <w:r>
           <w:rPr>
             <w:rStyle w:val="ac"/>
@@ -285,14 +350,12 @@
           </w:rPr>
           <w:t>ru</w:t>
         </w:r>
-        <w:proofErr w:type="spellEnd"/>
         <w:r>
           <w:rPr>
             <w:rStyle w:val="ac"/>
           </w:rPr>
           <w:t>/</w:t>
         </w:r>
-        <w:proofErr w:type="spellStart"/>
         <w:r>
           <w:rPr>
             <w:rStyle w:val="ac"/>
@@ -300,7 +363,6 @@
           </w:rPr>
           <w:t>eng</w:t>
         </w:r>
-        <w:proofErr w:type="spellEnd"/>
         <w:r>
           <w:rPr>
             <w:rStyle w:val="ac"/>
@@ -320,7 +382,6 @@
           </w:rPr>
           <w:t>_</w:t>
         </w:r>
-        <w:proofErr w:type="spellStart"/>
         <w:r>
           <w:rPr>
             <w:rStyle w:val="ac"/>
@@ -328,14 +389,12 @@
           </w:rPr>
           <w:t>br</w:t>
         </w:r>
-        <w:proofErr w:type="spellEnd"/>
         <w:r>
           <w:rPr>
             <w:rStyle w:val="ac"/>
           </w:rPr>
           <w:t>/</w:t>
         </w:r>
-        <w:proofErr w:type="spellStart"/>
         <w:r>
           <w:rPr>
             <w:rStyle w:val="ac"/>
@@ -343,14 +402,12 @@
           </w:rPr>
           <w:t>publ</w:t>
         </w:r>
-        <w:proofErr w:type="spellEnd"/>
         <w:r>
           <w:rPr>
             <w:rStyle w:val="ac"/>
           </w:rPr>
           <w:t>/</w:t>
         </w:r>
-        <w:proofErr w:type="spellStart"/>
         <w:r>
           <w:rPr>
             <w:rStyle w:val="ac"/>
@@ -358,7 +415,6 @@
           </w:rPr>
           <w:t>ondkp</w:t>
         </w:r>
-        <w:proofErr w:type="spellEnd"/>
         <w:r>
           <w:rPr>
             <w:rStyle w:val="ac"/>
@@ -443,10 +499,7 @@
         <w:t>внешняя неопределённость</w:t>
       </w:r>
       <w:r>
-        <w:t xml:space="preserve">: VIX, волатильность нефтяного рынка и волатильность валютного курса. ECB прямо указывает, что потребительская уверенность связана с ожиданиями по личным финансам и крупным покупкам, а неопределённость влияет на склонность домохозяйств сокращать расходы или откладывать крупные покупки. </w:t>
-      </w:r>
-      <w:r>
-        <w:t>(</w:t>
+        <w:t>: VIX, волатильность нефтяного рынка и волатильность валютного курса. ECB прямо указывает, что потребительская уверенность связана с ожиданиями по личным финансам и крупным покупкам, а неопределённость влияет на склонность домохозяйств сокращать расходы или откладывать крупные покупки. (</w:t>
       </w:r>
       <w:hyperlink r:id="rId7" w:history="1">
         <w:r>
@@ -475,7 +528,6 @@
           </w:rPr>
           <w:t>.</w:t>
         </w:r>
-        <w:proofErr w:type="spellStart"/>
         <w:r>
           <w:rPr>
             <w:rStyle w:val="ac"/>
@@ -483,14 +535,12 @@
           </w:rPr>
           <w:t>ecb</w:t>
         </w:r>
-        <w:proofErr w:type="spellEnd"/>
         <w:r>
           <w:rPr>
             <w:rStyle w:val="ac"/>
           </w:rPr>
           <w:t>.</w:t>
         </w:r>
-        <w:proofErr w:type="spellStart"/>
         <w:r>
           <w:rPr>
             <w:rStyle w:val="ac"/>
@@ -498,14 +548,12 @@
           </w:rPr>
           <w:t>europa</w:t>
         </w:r>
-        <w:proofErr w:type="spellEnd"/>
         <w:r>
           <w:rPr>
             <w:rStyle w:val="ac"/>
           </w:rPr>
           <w:t>.</w:t>
         </w:r>
-        <w:proofErr w:type="spellStart"/>
         <w:r>
           <w:rPr>
             <w:rStyle w:val="ac"/>
@@ -513,7 +561,6 @@
           </w:rPr>
           <w:t>eu</w:t>
         </w:r>
-        <w:proofErr w:type="spellEnd"/>
         <w:r>
           <w:rPr>
             <w:rStyle w:val="ac"/>
@@ -585,7 +632,6 @@
           </w:rPr>
           <w:t>/</w:t>
         </w:r>
-        <w:proofErr w:type="spellStart"/>
         <w:r>
           <w:rPr>
             <w:rStyle w:val="ac"/>
@@ -593,14 +639,12 @@
           </w:rPr>
           <w:t>ecb</w:t>
         </w:r>
-        <w:proofErr w:type="spellEnd"/>
         <w:r>
           <w:rPr>
             <w:rStyle w:val="ac"/>
           </w:rPr>
           <w:t>.</w:t>
         </w:r>
-        <w:proofErr w:type="spellStart"/>
         <w:r>
           <w:rPr>
             <w:rStyle w:val="ac"/>
@@ -608,7 +652,6 @@
           </w:rPr>
           <w:t>ebbox</w:t>
         </w:r>
-        <w:proofErr w:type="spellEnd"/>
         <w:r>
           <w:rPr>
             <w:rStyle w:val="ac"/>
@@ -695,7 +738,13 @@
         <w:t>-1</w:t>
       </w:r>
       <w:r>
-        <w:t xml:space="preserve">. Тогда канал становиться устойчивым или усиливается, если он в периоде </w:t>
+        <w:t>. Тогда канал становиться устойчивым или усиливается</w:t>
+      </w:r>
+      <w:r>
+        <w:t xml:space="preserve"> при прочих равных</w:t>
+      </w:r>
+      <w:r>
+        <w:t xml:space="preserve">, если он в периоде </w:t>
       </w:r>
       <w:r>
         <w:rPr>
@@ -755,10 +804,7 @@
         <w:t>канал неопределённости</w:t>
       </w:r>
       <w:r>
-        <w:t xml:space="preserve">, то в центре внимания оказываются VIX, волатильность нефти, волатильность валютного курса и потребительское доверие; тогда домохозяйства считывают прежде всего не уровень текущих цен, а степень предсказуемости будущей среды, а для бизнеса это означает необходимость более осторожно выстраивать планы запасов, закупок, кредитных лимитов и ликвидности. Такой вывод согласуется с материалами ECB о том, что неопределённость напрямую связана с поведением по потреблению и сбережениям, а также с тем, что потребительская уверенность используется аналитиками и политиками как своевременный индикатор состояния экономики. </w:t>
-      </w:r>
-      <w:r>
-        <w:t>(</w:t>
+        <w:t>, то в центре внимания оказываются VIX, волатильность нефти, волатильность валютного курса и потребительское доверие; тогда домохозяйства считывают прежде всего не уровень текущих цен, а степень предсказуемости будущей среды, а для бизнеса это означает необходимость более осторожно выстраивать планы запасов, закупок, кредитных лимитов и ликвидности. Такой вывод согласуется с материалами ECB о том, что неопределённость напрямую связана с поведением по потреблению и сбережениям, а также с тем, что потребительская уверенность используется аналитиками и политиками как своевременный индикатор состояния экономики. (</w:t>
       </w:r>
       <w:hyperlink r:id="rId8" w:history="1">
         <w:r>
@@ -787,7 +833,6 @@
           </w:rPr>
           <w:t>.</w:t>
         </w:r>
-        <w:proofErr w:type="spellStart"/>
         <w:r>
           <w:rPr>
             <w:rStyle w:val="ac"/>
@@ -795,14 +840,12 @@
           </w:rPr>
           <w:t>ecb</w:t>
         </w:r>
-        <w:proofErr w:type="spellEnd"/>
         <w:r>
           <w:rPr>
             <w:rStyle w:val="ac"/>
           </w:rPr>
           <w:t>.</w:t>
         </w:r>
-        <w:proofErr w:type="spellStart"/>
         <w:r>
           <w:rPr>
             <w:rStyle w:val="ac"/>
@@ -810,14 +853,12 @@
           </w:rPr>
           <w:t>europa</w:t>
         </w:r>
-        <w:proofErr w:type="spellEnd"/>
         <w:r>
           <w:rPr>
             <w:rStyle w:val="ac"/>
           </w:rPr>
           <w:t>.</w:t>
         </w:r>
-        <w:proofErr w:type="spellStart"/>
         <w:r>
           <w:rPr>
             <w:rStyle w:val="ac"/>
@@ -825,7 +866,6 @@
           </w:rPr>
           <w:t>eu</w:t>
         </w:r>
-        <w:proofErr w:type="spellEnd"/>
         <w:r>
           <w:rPr>
             <w:rStyle w:val="ac"/>
@@ -897,7 +937,6 @@
           </w:rPr>
           <w:t>/</w:t>
         </w:r>
-        <w:proofErr w:type="spellStart"/>
         <w:r>
           <w:rPr>
             <w:rStyle w:val="ac"/>
@@ -905,14 +944,12 @@
           </w:rPr>
           <w:t>ecb</w:t>
         </w:r>
-        <w:proofErr w:type="spellEnd"/>
         <w:r>
           <w:rPr>
             <w:rStyle w:val="ac"/>
           </w:rPr>
           <w:t>.</w:t>
         </w:r>
-        <w:proofErr w:type="spellStart"/>
         <w:r>
           <w:rPr>
             <w:rStyle w:val="ac"/>
@@ -920,7 +957,6 @@
           </w:rPr>
           <w:t>ebbox</w:t>
         </w:r>
-        <w:proofErr w:type="spellEnd"/>
         <w:r>
           <w:rPr>
             <w:rStyle w:val="ac"/>
@@ -966,7 +1002,6 @@
           </w:rPr>
           <w:t>.</w:t>
         </w:r>
-        <w:proofErr w:type="spellStart"/>
         <w:r>
           <w:rPr>
             <w:rStyle w:val="ac"/>
@@ -974,7 +1009,6 @@
           </w:rPr>
           <w:t>bg</w:t>
         </w:r>
-        <w:proofErr w:type="spellEnd"/>
         <w:r>
           <w:rPr>
             <w:rStyle w:val="ac"/>
@@ -1028,7 +1062,13 @@
     </w:p>
     <w:p>
       <w:r>
-        <w:t xml:space="preserve">В российском контексте этот вывод особенно значим. Банк России прямо связывает ключевую ставку с формированием процентных условий в экономике и отдельно подчёркивает роль инфляционных ожиданий и коммуникации в передаче политики. Поэтому ваш результат можно использовать как </w:t>
+        <w:t xml:space="preserve">В российском контексте этот вывод особенно значим. Банк России прямо связывает ключевую ставку с формированием процентных условий в экономике и отдельно подчёркивает роль инфляционных ожиданий и коммуникации в передаче политики. Поэтому </w:t>
+      </w:r>
+      <w:r>
+        <w:t>наш</w:t>
+      </w:r>
+      <w:r>
+        <w:t xml:space="preserve"> результат можно использовать как </w:t>
       </w:r>
       <w:r>
         <w:rPr>
@@ -1655,6 +1695,7 @@
   <w:style w:type="character" w:default="1" w:styleId="a0">
     <w:name w:val="Default Paragraph Font"/>
     <w:uiPriority w:val="1"/>
+    <w:semiHidden/>
     <w:unhideWhenUsed/>
   </w:style>
   <w:style w:type="table" w:default="1" w:styleId="a1">

</xml_diff>